<commit_message>
Task 3: dien WBS; truy nguon du lieu IMDb (CC0) va cap nhat Action Plan
- Truy vet duoc bo du lieu: data/raw/part-01.json la 1 shard cua Kaggle
  "IMDb Review Dataset - ebD" (giay phep CC0, 1.010.296 review do truc tiep).
  Chot IMDb la du lieu huan luyen chinh; loai YoutubeCommentsDataSet.csv
  (khong truy vet duoc nguon/giay phep) khoi bao cao.
- data/raw/SOURCE.md: thay metadata sai cua bo CSV cu bang so lieu do that
  (so ban ghi, phan bo rating, md5, ngay kiem tra) + muc "da loai bo".
- scripts/fill_wbs.py + deliverables/WBS.xlsx: 7 nhom viec / 32 dong,
  D1-D20 = 15/09-04/10/2026, phan cong 5 thanh vien, Gantt to theo ngay,
  trang thai ghi dung thuc te ngay 14/10. Tu kiem bo cuc PDF 2 trang.
- Action Plan (muc Data/Abstract) cap nhat theo du lieu moi, xuat lai
  docx+pdf: 5 trang, khong con trang trang.
- PROGRESS.md: ghi Task 2b/2c/3, cap nhat danh sach chan tien do.

Co-Authored-By: Claude Code <noreply@anthropic.com>
</commit_message>
<xml_diff>
--- a/deliverables/Action_Plan.docx
+++ b/deliverables/Action_Plan.docx
@@ -1046,7 +1046,7 @@
                 <w:sz w:val="28"/>
                 <w:szCs w:val="28"/>
               </w:rPr>
-              <w:t xml:space="preserve">Live chat moves far faster than a solo streamer can read, so harmful comment spikes are usually noticed only after the damage is done. This project builds a real-time sentiment classification pipeline: comments are ingested through Apache Kafka, processed by Spark Structured Streaming with event-time windows and watermarks, and scored by a Spark ML model into negative, neutral and positive. Results are aggregated per one-minute window and an alert is raised when the negative ratio crosses a configurable threshold. Because labelled live chat is not publicly available and platform terms restrict retaining user comments, the model is trained on a public labelled comment dataset and the live stream is reproduced by replaying that data through Kafka.</w:t>
+              <w:t xml:space="preserve">Live chat moves far faster than a solo streamer can read, so harmful comment spikes are usually noticed only after the damage is done. This project builds a real-time sentiment classification pipeline: comments are ingested through Apache Kafka, processed by Spark Structured Streaming with event-time windows and watermarks, and scored by a Spark ML model into negative, neutral and positive. Results are aggregated per one-minute window and an alert is raised when the negative ratio crosses a configurable threshold. Because labelled live chat is not publicly available and platform terms restrict retaining user comments, the model is trained on a public, CC0-licensed IMDb review dataset, with the three sentiment classes derived from user ratings, and the live stream is reproduced by replaying that data through Kafka.</w:t>
             </w:r>
           </w:p>
         </w:tc>
@@ -1262,7 +1262,7 @@
                 <w:sz w:val="28"/>
                 <w:szCs w:val="28"/>
               </w:rPr>
-              <w:t xml:space="preserve">The model is trained on a public labelled dataset of online comments with three sentiment classes; the exact source and licence are recorded before any reported result uses it. Live chat comments are not publicly available with sentiment labels, and platform terms restrict retaining user comments, so the live stream is simulated: the labelled dataset is replayed through Kafka at a configurable rate, with random bursts and a small share of deliberately late records to exercise watermarking and the dead-letter queue. Labels never enter the stream; they are stored separately and joined back by comment ID only for evaluation. User identifiers are replaced with salted hashes and no personal data is retained.</w:t>
+              <w:t xml:space="preserve">The model is trained on a public IMDb review dataset under CC0 (about 1.0 million reviews; source and licence in data/raw/SOURCE.md). It carries no sentiment labels: the three classes are derived from the 1-10 user ratings by a documented mapping, reported as rating-derived labels. Live chat is not available with sentiment labels and platform terms restrict retaining it, so the stream is simulated: the dataset is replayed through Kafka at a configurable rate, with bursts and deliberately late records to exercise watermarking and the dead-letter queue. Labels never enter the stream; they are stored separately and joined back by comment ID for evaluation. User identifiers are replaced with salted hashes and no personal data is retained.</w:t>
             </w:r>
           </w:p>
         </w:tc>

</xml_diff>